<commit_message>
minor change in CV
</commit_message>
<xml_diff>
--- a/Farzad_Pourbabaee_CV.docx
+++ b/Farzad_Pourbabaee_CV.docx
@@ -25,22 +25,6 @@
           <w:tab w:val="left" w:pos="7560"/>
         </w:tabs>
         <w:rPr>
-          <w:rFonts w:asciiTheme="majorBidi" w:hAnsiTheme="majorBidi" w:cstheme="majorBidi"/>
-          <w:bCs/>
-          <w:sz w:val="28"/>
-          <w:szCs w:val="28"/>
-        </w:rPr>
-      </w:pPr>
-    </w:p>
-    <w:p>
-      <w:pPr>
-        <w:tabs>
-          <w:tab w:val="left" w:pos="-906"/>
-          <w:tab w:val="left" w:pos="-450"/>
-          <w:tab w:val="center" w:pos="5040"/>
-          <w:tab w:val="left" w:pos="7560"/>
-        </w:tabs>
-        <w:rPr>
           <w:rStyle w:val="Hyperlink"/>
           <w:rFonts w:asciiTheme="majorBidi" w:hAnsiTheme="majorBidi" w:cstheme="majorBidi"/>
           <w:color w:val="auto"/>
@@ -62,19 +46,14 @@
     <w:p>
       <w:pPr>
         <w:tabs>
+          <w:tab w:val="left" w:pos="4320"/>
           <w:tab w:val="center" w:pos="5040"/>
+          <w:tab w:val="left" w:pos="5580"/>
           <w:tab w:val="left" w:pos="6462"/>
           <w:tab w:val="left" w:pos="7362"/>
         </w:tabs>
+        <w:spacing w:line="276" w:lineRule="auto"/>
         <w:jc w:val="both"/>
-        <w:rPr>
-          <w:rFonts w:asciiTheme="majorBidi" w:hAnsiTheme="majorBidi" w:cstheme="majorBidi"/>
-          <w:color w:val="1F497D" w:themeColor="text2"/>
-          <w:sz w:val="20"/>
-          <w:szCs w:val="20"/>
-        </w:rPr>
-      </w:pPr>
-      <w:r>
         <w:rPr>
           <w:rStyle w:val="Hyperlink"/>
           <w:rFonts w:asciiTheme="majorBidi" w:hAnsiTheme="majorBidi" w:cstheme="majorBidi"/>
@@ -83,9 +62,7 @@
           <w:szCs w:val="32"/>
           <w:u w:val="none"/>
         </w:rPr>
-        <w:t xml:space="preserve">Farzad </w:t>
-      </w:r>
-      <w:proofErr w:type="spellStart"/>
+      </w:pPr>
       <w:r>
         <w:rPr>
           <w:rStyle w:val="Hyperlink"/>
@@ -95,6 +72,18 @@
           <w:szCs w:val="32"/>
           <w:u w:val="none"/>
         </w:rPr>
+        <w:t xml:space="preserve">Farzad </w:t>
+      </w:r>
+      <w:proofErr w:type="spellStart"/>
+      <w:r>
+        <w:rPr>
+          <w:rStyle w:val="Hyperlink"/>
+          <w:rFonts w:asciiTheme="majorBidi" w:hAnsiTheme="majorBidi" w:cstheme="majorBidi"/>
+          <w:color w:val="000000" w:themeColor="text1"/>
+          <w:sz w:val="32"/>
+          <w:szCs w:val="32"/>
+          <w:u w:val="none"/>
+        </w:rPr>
         <w:t>Pourbabaee</w:t>
       </w:r>
       <w:proofErr w:type="spellEnd"/>
@@ -102,41 +91,92 @@
         <w:rPr>
           <w:rStyle w:val="Hyperlink"/>
           <w:rFonts w:asciiTheme="majorBidi" w:hAnsiTheme="majorBidi" w:cstheme="majorBidi"/>
-          <w:b/>
-          <w:bCs/>
           <w:color w:val="000000" w:themeColor="text1"/>
+          <w:sz w:val="32"/>
+          <w:szCs w:val="32"/>
           <w:u w:val="none"/>
         </w:rPr>
-        <w:t xml:space="preserve"> </w:t>
+        <w:tab/>
       </w:r>
       <w:r>
         <w:rPr>
           <w:rStyle w:val="Hyperlink"/>
           <w:rFonts w:asciiTheme="majorBidi" w:hAnsiTheme="majorBidi" w:cstheme="majorBidi"/>
-          <w:color w:val="1F497D" w:themeColor="text2"/>
+          <w:color w:val="000000" w:themeColor="text1"/>
           <w:sz w:val="20"/>
           <w:szCs w:val="20"/>
           <w:u w:val="none"/>
         </w:rPr>
-        <w:t xml:space="preserve">      </w:t>
-      </w:r>
-      <w:r>
-        <w:rPr>
-          <w:rStyle w:val="Hyperlink"/>
-          <w:rFonts w:asciiTheme="majorBidi" w:hAnsiTheme="majorBidi" w:cstheme="majorBidi"/>
-          <w:color w:val="1F497D" w:themeColor="text2"/>
-          <w:sz w:val="20"/>
-          <w:szCs w:val="20"/>
-          <w:u w:val="none"/>
-        </w:rPr>
-        <w:t xml:space="preserve">E-mail: </w:t>
+        <w:t xml:space="preserve">Webpage: </w:t>
       </w:r>
       <w:hyperlink r:id="rId8" w:history="1">
         <w:r>
           <w:rPr>
             <w:rStyle w:val="Hyperlink"/>
             <w:rFonts w:asciiTheme="majorBidi" w:hAnsiTheme="majorBidi" w:cstheme="majorBidi"/>
-            <w:color w:val="365F91" w:themeColor="accent1" w:themeShade="BF"/>
+            <w:sz w:val="20"/>
+            <w:szCs w:val="20"/>
+          </w:rPr>
+          <w:t>https://farzad-pourbabaee.github.io</w:t>
+        </w:r>
+      </w:hyperlink>
+      <w:r>
+        <w:rPr>
+          <w:rStyle w:val="Hyperlink"/>
+          <w:rFonts w:asciiTheme="majorBidi" w:hAnsiTheme="majorBidi" w:cstheme="majorBidi"/>
+          <w:color w:val="000000" w:themeColor="text1"/>
+          <w:sz w:val="32"/>
+          <w:szCs w:val="32"/>
+          <w:u w:val="none"/>
+        </w:rPr>
+        <w:t xml:space="preserve"> </w:t>
+      </w:r>
+      <w:r>
+        <w:rPr>
+          <w:rStyle w:val="Hyperlink"/>
+          <w:rFonts w:asciiTheme="majorBidi" w:hAnsiTheme="majorBidi" w:cstheme="majorBidi"/>
+          <w:color w:val="000000" w:themeColor="text1"/>
+          <w:sz w:val="32"/>
+          <w:szCs w:val="32"/>
+          <w:u w:val="none"/>
+        </w:rPr>
+        <w:tab/>
+      </w:r>
+    </w:p>
+    <w:p>
+      <w:pPr>
+        <w:tabs>
+          <w:tab w:val="left" w:pos="4320"/>
+          <w:tab w:val="center" w:pos="5040"/>
+          <w:tab w:val="left" w:pos="5580"/>
+          <w:tab w:val="left" w:pos="6462"/>
+          <w:tab w:val="left" w:pos="7362"/>
+        </w:tabs>
+        <w:spacing w:line="276" w:lineRule="auto"/>
+        <w:jc w:val="both"/>
+        <w:rPr>
+          <w:rFonts w:asciiTheme="majorBidi" w:hAnsiTheme="majorBidi" w:cstheme="majorBidi"/>
+          <w:color w:val="1F497D" w:themeColor="text2"/>
+          <w:sz w:val="20"/>
+          <w:szCs w:val="20"/>
+        </w:rPr>
+      </w:pPr>
+      <w:r>
+        <w:rPr>
+          <w:rStyle w:val="Hyperlink"/>
+          <w:rFonts w:asciiTheme="majorBidi" w:hAnsiTheme="majorBidi" w:cstheme="majorBidi"/>
+          <w:color w:val="000000" w:themeColor="text1"/>
+          <w:sz w:val="20"/>
+          <w:szCs w:val="20"/>
+          <w:u w:val="none"/>
+        </w:rPr>
+        <w:t xml:space="preserve">E-mail: </w:t>
+      </w:r>
+      <w:hyperlink r:id="rId9" w:history="1">
+        <w:r>
+          <w:rPr>
+            <w:rStyle w:val="Hyperlink"/>
+            <w:rFonts w:asciiTheme="majorBidi" w:hAnsiTheme="majorBidi" w:cstheme="majorBidi"/>
             <w:sz w:val="20"/>
             <w:szCs w:val="20"/>
           </w:rPr>
@@ -147,46 +187,43 @@
         <w:rPr>
           <w:rStyle w:val="Hyperlink"/>
           <w:rFonts w:asciiTheme="majorBidi" w:hAnsiTheme="majorBidi" w:cstheme="majorBidi"/>
-          <w:color w:val="365F91" w:themeColor="accent1" w:themeShade="BF"/>
+          <w:color w:val="000000" w:themeColor="text1"/>
           <w:sz w:val="20"/>
           <w:szCs w:val="20"/>
           <w:u w:val="none"/>
         </w:rPr>
-        <w:t xml:space="preserve">      </w:t>
-      </w:r>
-      <w:r>
-        <w:rPr>
-          <w:rStyle w:val="Hyperlink"/>
-          <w:rFonts w:asciiTheme="majorBidi" w:hAnsiTheme="majorBidi" w:cstheme="majorBidi"/>
-          <w:color w:val="1F497D" w:themeColor="text2"/>
-          <w:sz w:val="20"/>
-          <w:szCs w:val="20"/>
-          <w:u w:val="none"/>
-        </w:rPr>
-        <w:t xml:space="preserve">Webpage: </w:t>
-      </w:r>
-      <w:hyperlink r:id="rId9" w:history="1">
+        <w:tab/>
+      </w:r>
+      <w:hyperlink r:id="rId10" w:history="1">
         <w:r>
           <w:rPr>
             <w:rStyle w:val="Hyperlink"/>
             <w:rFonts w:asciiTheme="majorBidi" w:hAnsiTheme="majorBidi" w:cstheme="majorBidi"/>
-            <w:color w:val="1F497D" w:themeColor="text2"/>
             <w:sz w:val="20"/>
             <w:szCs w:val="20"/>
           </w:rPr>
-          <w:t>https://farzad-pourbabaee.github.io/</w:t>
+          <w:t>Google Scholar</w:t>
+        </w:r>
+        <w:r>
+          <w:rPr>
+            <w:rStyle w:val="Hyperlink"/>
+            <w:rFonts w:asciiTheme="majorBidi" w:hAnsiTheme="majorBidi" w:cstheme="majorBidi"/>
+            <w:b/>
+            <w:bCs/>
+          </w:rPr>
+          <w:tab/>
         </w:r>
       </w:hyperlink>
       <w:r>
         <w:rPr>
           <w:rStyle w:val="Hyperlink"/>
           <w:rFonts w:asciiTheme="majorBidi" w:hAnsiTheme="majorBidi" w:cstheme="majorBidi"/>
-          <w:color w:val="1F497D" w:themeColor="text2"/>
-          <w:sz w:val="20"/>
-          <w:szCs w:val="20"/>
+          <w:b/>
+          <w:bCs/>
+          <w:color w:val="000000" w:themeColor="text1"/>
           <w:u w:val="none"/>
         </w:rPr>
-        <w:t xml:space="preserve">       </w:t>
+        <w:tab/>
       </w:r>
     </w:p>
     <w:p>
@@ -257,15 +294,7 @@
           <w:sz w:val="20"/>
           <w:szCs w:val="20"/>
         </w:rPr>
-        <w:t xml:space="preserve">, </w:t>
-      </w:r>
-      <w:r>
-        <w:rPr>
-          <w:rFonts w:asciiTheme="majorBidi" w:hAnsiTheme="majorBidi" w:cstheme="majorBidi"/>
-          <w:sz w:val="20"/>
-          <w:szCs w:val="20"/>
-        </w:rPr>
-        <w:t>Probability and Statistics</w:t>
+        <w:t>, Probability and Statistics</w:t>
       </w:r>
       <w:r>
         <w:rPr>
@@ -1178,7 +1207,7 @@
         </w:rPr>
         <w:t xml:space="preserve"> </w:t>
       </w:r>
-      <w:hyperlink r:id="rId10" w:history="1">
+      <w:hyperlink r:id="rId11" w:history="1">
         <w:r>
           <w:rPr>
             <w:rStyle w:val="Hyperlink"/>
@@ -1286,7 +1315,7 @@
         </w:rPr>
         <w:t xml:space="preserve"> </w:t>
       </w:r>
-      <w:hyperlink r:id="rId11" w:history="1">
+      <w:hyperlink r:id="rId12" w:history="1">
         <w:r>
           <w:rPr>
             <w:rStyle w:val="Hyperlink"/>
@@ -1430,7 +1459,7 @@
         </w:rPr>
         <w:t xml:space="preserve"> </w:t>
       </w:r>
-      <w:hyperlink r:id="rId12" w:history="1">
+      <w:hyperlink r:id="rId13" w:history="1">
         <w:r>
           <w:rPr>
             <w:rStyle w:val="Hyperlink"/>
@@ -1583,85 +1612,78 @@
           <w:sz w:val="20"/>
           <w:szCs w:val="20"/>
         </w:rPr>
+        <w:t xml:space="preserve"> M. J. </w:t>
+      </w:r>
+      <w:proofErr w:type="spellStart"/>
+      <w:r>
+        <w:rPr>
+          <w:sz w:val="20"/>
+          <w:szCs w:val="20"/>
+        </w:rPr>
+        <w:t>Emadi</w:t>
+      </w:r>
+      <w:proofErr w:type="spellEnd"/>
+      <w:r>
+        <w:rPr>
+          <w:sz w:val="20"/>
+          <w:szCs w:val="20"/>
+        </w:rPr>
+        <w:t xml:space="preserve">, A. G. </w:t>
+      </w:r>
+      <w:proofErr w:type="spellStart"/>
+      <w:r>
+        <w:rPr>
+          <w:sz w:val="20"/>
+          <w:szCs w:val="20"/>
+        </w:rPr>
+        <w:t>Davoodi</w:t>
+      </w:r>
+      <w:proofErr w:type="spellEnd"/>
+      <w:r>
+        <w:rPr>
+          <w:sz w:val="20"/>
+          <w:szCs w:val="20"/>
+        </w:rPr>
+        <w:t xml:space="preserve">, and M. R. </w:t>
+      </w:r>
+      <w:proofErr w:type="spellStart"/>
+      <w:r>
+        <w:rPr>
+          <w:sz w:val="20"/>
+          <w:szCs w:val="20"/>
+        </w:rPr>
+        <w:t>Aref</w:t>
+      </w:r>
+      <w:proofErr w:type="spellEnd"/>
+      <w:r>
+        <w:rPr>
+          <w:sz w:val="20"/>
+          <w:szCs w:val="20"/>
+        </w:rPr>
+        <w:t>)</w:t>
+      </w:r>
+      <w:r>
+        <w:rPr>
+          <w:sz w:val="20"/>
+          <w:szCs w:val="20"/>
+        </w:rPr>
+        <w:t>,</w:t>
+      </w:r>
+      <w:r>
+        <w:rPr>
+          <w:sz w:val="20"/>
+          <w:szCs w:val="20"/>
+        </w:rPr>
+        <w:t xml:space="preserve"> 2012, </w:t>
+      </w:r>
+      <w:r>
+        <w:rPr>
+          <w:sz w:val="20"/>
+          <w:szCs w:val="20"/>
+        </w:rPr>
         <w:t xml:space="preserve"> </w:t>
       </w:r>
-      <w:r>
-        <w:rPr>
-          <w:sz w:val="20"/>
-          <w:szCs w:val="20"/>
-        </w:rPr>
-        <w:t xml:space="preserve">M. J. </w:t>
-      </w:r>
-      <w:proofErr w:type="spellStart"/>
-      <w:r>
-        <w:rPr>
-          <w:sz w:val="20"/>
-          <w:szCs w:val="20"/>
-        </w:rPr>
-        <w:t>Emadi</w:t>
-      </w:r>
-      <w:proofErr w:type="spellEnd"/>
-      <w:r>
-        <w:rPr>
-          <w:sz w:val="20"/>
-          <w:szCs w:val="20"/>
-        </w:rPr>
-        <w:t xml:space="preserve">, A. G. </w:t>
-      </w:r>
-      <w:proofErr w:type="spellStart"/>
-      <w:r>
-        <w:rPr>
-          <w:sz w:val="20"/>
-          <w:szCs w:val="20"/>
-        </w:rPr>
-        <w:t>Davoodi</w:t>
-      </w:r>
-      <w:proofErr w:type="spellEnd"/>
-      <w:r>
-        <w:rPr>
-          <w:sz w:val="20"/>
-          <w:szCs w:val="20"/>
-        </w:rPr>
-        <w:t xml:space="preserve">, and M. R. </w:t>
-      </w:r>
-      <w:proofErr w:type="spellStart"/>
-      <w:r>
-        <w:rPr>
-          <w:sz w:val="20"/>
-          <w:szCs w:val="20"/>
-        </w:rPr>
-        <w:t>Aref</w:t>
-      </w:r>
-      <w:proofErr w:type="spellEnd"/>
-      <w:r>
-        <w:rPr>
-          <w:sz w:val="20"/>
-          <w:szCs w:val="20"/>
-        </w:rPr>
-        <w:t>)</w:t>
-      </w:r>
-      <w:r>
-        <w:rPr>
-          <w:sz w:val="20"/>
-          <w:szCs w:val="20"/>
-        </w:rPr>
-        <w:t>,</w:t>
-      </w:r>
-      <w:r>
-        <w:rPr>
-          <w:sz w:val="20"/>
-          <w:szCs w:val="20"/>
-        </w:rPr>
-        <w:t xml:space="preserve"> 2012, </w:t>
-      </w:r>
-      <w:r>
-        <w:rPr>
-          <w:sz w:val="20"/>
-          <w:szCs w:val="20"/>
-        </w:rPr>
-        <w:t xml:space="preserve"> </w:t>
-      </w:r>
-      <w:hyperlink r:id="rId13" w:history="1">
+      <w:hyperlink r:id="rId14" w:history="1">
         <w:r>
           <w:rPr>
             <w:rStyle w:val="Hyperlink"/>

</xml_diff>